<commit_message>
Remove reviewer-profile sub-question from SOP and objectives
Removed the sub-question/objective asking for IT-professor reviewers'
age group, gender, and position, since the study does not intend to
identify reviewer backgrounds. Statement of the Problem and Specific
Objectives lists renumbered 1-5 accordingly.

Co-Authored-By: Claude Sonnet 5 <noreply@anthropic.com>
Claude-Session: https://claude.ai/code/session_01HHgk6AxrrbQ9rP6kJ4L8ig
</commit_message>
<xml_diff>
--- a/Introduction_ShelfSense.docx
+++ b/Introduction_ShelfSense.docx
@@ -728,7 +728,7 @@
           <w:b w:val="0"/>
           <w:i w:val="0"/>
         </w:rPr>
-        <w:t>1.  What is the profile of the 10 IT professors of NCST Dasmariñas, Cavite who serve as reviewers, in terms of age group, gender (when voluntarily provided), and position?</w:t>
+        <w:t>1.  Does each module produce correct results, such as payroll computation, attendance recording, requisition and payment approval routing, stock updates, and sales totals?</w:t>
       </w:r>
     </w:p>
     <w:p>
@@ -742,7 +742,7 @@
           <w:b w:val="0"/>
           <w:i w:val="0"/>
         </w:rPr>
-        <w:t>2.  Does each module produce correct results, such as payroll computation, attendance recording, requisition and payment approval routing, stock updates, and sales totals?</w:t>
+        <w:t>2.  What is the task completion rate when the main task of each module is performed from start to end?</w:t>
       </w:r>
     </w:p>
     <w:p>
@@ -756,7 +756,7 @@
           <w:b w:val="0"/>
           <w:i w:val="0"/>
         </w:rPr>
-        <w:t>3.  What is the task completion rate when the main task of each module is performed from start to end?</w:t>
+        <w:t>3.  What is the processing time of the main tasks of each module?</w:t>
       </w:r>
     </w:p>
     <w:p>
@@ -770,7 +770,7 @@
           <w:b w:val="0"/>
           <w:i w:val="0"/>
         </w:rPr>
-        <w:t>4.  What is the processing time of the main tasks of each module?</w:t>
+        <w:t>4.  Does each user level access only the modules assigned to it?</w:t>
       </w:r>
     </w:p>
     <w:p>
@@ -784,21 +784,7 @@
           <w:b w:val="0"/>
           <w:i w:val="0"/>
         </w:rPr>
-        <w:t>5.  Does each user level access only the modules assigned to it?</w:t>
-      </w:r>
-    </w:p>
-    <w:p>
-      <w:pPr>
-        <w:spacing w:after="40"/>
-        <w:ind w:left="576"/>
-        <w:jc w:val="both"/>
-      </w:pPr>
-      <w:r>
-        <w:rPr>
-          <w:b w:val="0"/>
-          <w:i w:val="0"/>
-        </w:rPr>
-        <w:t>6.  What defects and improvements do the reviewers identify in each module?</w:t>
+        <w:t>5.  What defects and improvements do the reviewers identify in each module?</w:t>
       </w:r>
     </w:p>
     <w:p>
@@ -851,7 +837,7 @@
           <w:b w:val="0"/>
           <w:i w:val="0"/>
         </w:rPr>
-        <w:t>1.  describe the profile of the reviewers in terms of age group, gender (when voluntarily provided), and position;</w:t>
+        <w:t>1.  verify the functional correctness of the modules of each user level;</w:t>
       </w:r>
     </w:p>
     <w:p>
@@ -865,7 +851,7 @@
           <w:b w:val="0"/>
           <w:i w:val="0"/>
         </w:rPr>
-        <w:t>2.  verify the functional correctness of the modules of each user level;</w:t>
+        <w:t>2.  measure the task completion rate of the main task of each module;</w:t>
       </w:r>
     </w:p>
     <w:p>
@@ -879,7 +865,7 @@
           <w:b w:val="0"/>
           <w:i w:val="0"/>
         </w:rPr>
-        <w:t>3.  measure the task completion rate of the main task of each module;</w:t>
+        <w:t>3.  measure the processing time of the main task of each module;</w:t>
       </w:r>
     </w:p>
     <w:p>
@@ -893,7 +879,7 @@
           <w:b w:val="0"/>
           <w:i w:val="0"/>
         </w:rPr>
-        <w:t>4.  measure the processing time of the main task of each module;</w:t>
+        <w:t>4.  verify that each user level can access only its assigned modules; and</w:t>
       </w:r>
     </w:p>
     <w:p>
@@ -907,21 +893,7 @@
           <w:b w:val="0"/>
           <w:i w:val="0"/>
         </w:rPr>
-        <w:t>5.  verify that each user level can access only its assigned modules; and</w:t>
-      </w:r>
-    </w:p>
-    <w:p>
-      <w:pPr>
-        <w:spacing w:after="40"/>
-        <w:ind w:left="576"/>
-        <w:jc w:val="both"/>
-      </w:pPr>
-      <w:r>
-        <w:rPr>
-          <w:b w:val="0"/>
-          <w:i w:val="0"/>
-        </w:rPr>
-        <w:t>6.  record the defects found and recommend prioritized improvements.</w:t>
+        <w:t>5.  record the defects found and recommend prioritized improvements.</w:t>
       </w:r>
     </w:p>
     <w:p>

</xml_diff>

<commit_message>
Add required cover/title page
Added the cover page specified by the official format (study title,
mini-thesis byline, degree line, and blank Submitted By / Program and
Section / Submitted To / Date Submitted fields), placed before the
Introduction chapter.

Co-Authored-By: Claude Sonnet 5 <noreply@anthropic.com>
Claude-Session: https://claude.ai/code/session_01HHgk6AxrrbQ9rP6kJ4L8ig
</commit_message>
<xml_diff>
--- a/Introduction_ShelfSense.docx
+++ b/Introduction_ShelfSense.docx
@@ -2,6 +2,224 @@
 <file path=word/document.xml><?xml version="1.0" encoding="utf-8"?>
 <w:document xmlns:wpc="http://schemas.microsoft.com/office/word/2010/wordprocessingCanvas" xmlns:cx="http://schemas.microsoft.com/office/drawing/2014/chartex" xmlns:cx1="http://schemas.microsoft.com/office/drawing/2015/9/8/chartex" xmlns:cx2="http://schemas.microsoft.com/office/drawing/2015/10/21/chartex" xmlns:cx3="http://schemas.microsoft.com/office/drawing/2016/5/9/chartex" xmlns:cx4="http://schemas.microsoft.com/office/drawing/2016/5/10/chartex" xmlns:cx5="http://schemas.microsoft.com/office/drawing/2016/5/11/chartex" xmlns:cx6="http://schemas.microsoft.com/office/drawing/2016/5/12/chartex" xmlns:cx7="http://schemas.microsoft.com/office/drawing/2016/5/13/chartex" xmlns:cx8="http://schemas.microsoft.com/office/drawing/2016/5/14/chartex" xmlns:mc="http://schemas.openxmlformats.org/markup-compatibility/2006" xmlns:aink="http://schemas.microsoft.com/office/drawing/2016/ink" xmlns:am3d="http://schemas.microsoft.com/office/drawing/2017/model3d" xmlns:o="urn:schemas-microsoft-com:office:office" xmlns:oel="http://schemas.microsoft.com/office/2019/extlst" xmlns:r="http://schemas.openxmlformats.org/officeDocument/2006/relationships" xmlns:m="http://schemas.openxmlformats.org/officeDocument/2006/math" xmlns:v="urn:schemas-microsoft-com:vml" xmlns:wp14="http://schemas.microsoft.com/office/word/2010/wordprocessingDrawing" xmlns:wp="http://schemas.openxmlformats.org/drawingml/2006/wordprocessingDrawing" xmlns:w10="urn:schemas-microsoft-com:office:word" xmlns:w="http://schemas.openxmlformats.org/wordprocessingml/2006/main" xmlns:w14="http://schemas.microsoft.com/office/word/2010/wordml" xmlns:w15="http://schemas.microsoft.com/office/word/2012/wordml" xmlns:w16cex="http://schemas.microsoft.com/office/word/2018/wordml/cex" xmlns:w16cid="http://schemas.microsoft.com/office/word/2016/wordml/cid" xmlns:w16="http://schemas.microsoft.com/office/word/2018/wordml" xmlns:w16du="http://schemas.microsoft.com/office/word/2023/wordml/word16du" xmlns:w16sdtdh="http://schemas.microsoft.com/office/word/2020/wordml/sdtdatahash" xmlns:w16sdtfl="http://schemas.microsoft.com/office/word/2024/wordml/sdtformatlock" xmlns:w16se="http://schemas.microsoft.com/office/word/2015/wordml/symex" xmlns:wpg="http://schemas.microsoft.com/office/word/2010/wordprocessingGroup" xmlns:wpi="http://schemas.microsoft.com/office/word/2010/wordprocessingInk" xmlns:wne="http://schemas.microsoft.com/office/word/2006/wordml" xmlns:wps="http://schemas.microsoft.com/office/word/2010/wordprocessingShape" mc:Ignorable="w14 w15 w16se w16cid w16 w16cex w16sdtdh w16sdtfl w16du wp14">
   <w:body>
+    <w:p>
+      <w:pPr>
+        <w:spacing w:after="40"/>
+        <w:jc w:val="center"/>
+      </w:pPr>
+      <w:r>
+        <w:rPr>
+          <w:b/>
+          <w:i w:val="0"/>
+        </w:rPr>
+        <w:t xml:space="preserve">Software Usability Evaluation</w:t>
+      </w:r>
+    </w:p>
+    <w:p>
+      <w:pPr>
+        <w:spacing w:after="600"/>
+        <w:jc w:val="center"/>
+      </w:pPr>
+      <w:r>
+        <w:rPr>
+          <w:b w:val="0"/>
+          <w:i w:val="0"/>
+        </w:rPr>
+        <w:t xml:space="preserve">ShelfSense: A Web-Based Integrated Retail Management System with Facial Recognition Attendance Verification, Multi-Role Human Resource Administration, Supplier-Linked Inventory Procurement, and Point-of-Sale Transaction Processing for Small and Medium Retail Enterprises</w:t>
+      </w:r>
+    </w:p>
+    <w:p>
+      <w:pPr>
+        <w:spacing w:after="400"/>
+        <w:jc w:val="center"/>
+      </w:pPr>
+      <w:r>
+        <w:rPr>
+          <w:b w:val="0"/>
+          <w:i w:val="0"/>
+        </w:rPr>
+        <w:t xml:space="preserve">A Mini Thesis Project</w:t>
+      </w:r>
+    </w:p>
+    <w:p>
+      <w:pPr>
+        <w:spacing w:after="200"/>
+        <w:jc w:val="center"/>
+      </w:pPr>
+      <w:r>
+        <w:rPr>
+          <w:b w:val="0"/>
+          <w:i w:val="0"/>
+        </w:rPr>
+        <w:t xml:space="preserve">Presented to the Faculty of</w:t>
+      </w:r>
+    </w:p>
+    <w:p>
+      <w:pPr>
+        <w:spacing w:after="200"/>
+        <w:jc w:val="center"/>
+      </w:pPr>
+      <w:r>
+        <w:rPr>
+          <w:b w:val="0"/>
+          <w:i w:val="0"/>
+        </w:rPr>
+        <w:t xml:space="preserve">Computer Studies Department</w:t>
+      </w:r>
+    </w:p>
+    <w:p>
+      <w:pPr>
+        <w:spacing w:after="600"/>
+        <w:jc w:val="center"/>
+      </w:pPr>
+      <w:r>
+        <w:rPr>
+          <w:b/>
+          <w:i w:val="0"/>
+        </w:rPr>
+        <w:t xml:space="preserve">National College of Science and Technology</w:t>
+      </w:r>
+    </w:p>
+    <w:p>
+      <w:pPr>
+        <w:spacing w:after="200"/>
+        <w:jc w:val="center"/>
+      </w:pPr>
+      <w:r>
+        <w:rPr>
+          <w:b w:val="0"/>
+          <w:i w:val="0"/>
+        </w:rPr>
+        <w:t xml:space="preserve">In Partial Fulfillment</w:t>
+      </w:r>
+    </w:p>
+    <w:p>
+      <w:pPr>
+        <w:spacing w:after="200"/>
+        <w:jc w:val="center"/>
+      </w:pPr>
+      <w:r>
+        <w:rPr>
+          <w:b w:val="0"/>
+          <w:i w:val="0"/>
+        </w:rPr>
+        <w:t xml:space="preserve">Of the Requirements for the Degree</w:t>
+      </w:r>
+    </w:p>
+    <w:p>
+      <w:pPr>
+        <w:spacing w:after="800"/>
+        <w:jc w:val="center"/>
+      </w:pPr>
+      <w:r>
+        <w:rPr>
+          <w:b/>
+          <w:i w:val="0"/>
+        </w:rPr>
+        <w:t xml:space="preserve">Bachelor of Science in Information Technology</w:t>
+      </w:r>
+    </w:p>
+    <w:p>
+      <w:pPr>
+        <w:spacing w:after="200"/>
+      </w:pPr>
+      <w:r>
+        <w:rPr>
+          <w:b w:val="0"/>
+          <w:i w:val="0"/>
+        </w:rPr>
+        <w:t xml:space="preserve">Submitted By:</w:t>
+      </w:r>
+    </w:p>
+    <w:p>
+      <w:pPr>
+        <w:spacing w:after="40"/>
+      </w:pPr>
+      <w:r>
+        <w:rPr>
+          <w:b w:val="0"/>
+          <w:i w:val="0"/>
+        </w:rPr>
+        <w:t xml:space="preserve">______________________________</w:t>
+      </w:r>
+    </w:p>
+    <w:p>
+      <w:pPr>
+        <w:spacing w:after="200"/>
+      </w:pPr>
+      <w:r>
+        <w:rPr>
+          <w:b w:val="0"/>
+          <w:i w:val="0"/>
+        </w:rPr>
+        <w:t xml:space="preserve">Researchers</w:t>
+      </w:r>
+    </w:p>
+    <w:p>
+      <w:pPr>
+        <w:spacing w:after="600"/>
+      </w:pPr>
+      <w:r>
+        <w:rPr>
+          <w:b w:val="0"/>
+          <w:i w:val="0"/>
+        </w:rPr>
+        <w:t xml:space="preserve">Program and Section: ________________________</w:t>
+      </w:r>
+    </w:p>
+    <w:p>
+      <w:pPr>
+        <w:spacing w:after="200"/>
+      </w:pPr>
+      <w:r>
+        <w:rPr>
+          <w:b w:val="0"/>
+          <w:i w:val="0"/>
+        </w:rPr>
+        <w:t xml:space="preserve">Submitted To:</w:t>
+      </w:r>
+    </w:p>
+    <w:p>
+      <w:pPr>
+        <w:spacing w:after="40"/>
+      </w:pPr>
+      <w:r>
+        <w:rPr>
+          <w:b w:val="0"/>
+          <w:i w:val="0"/>
+        </w:rPr>
+        <w:t xml:space="preserve">______________________________</w:t>
+      </w:r>
+    </w:p>
+    <w:p>
+      <w:pPr>
+        <w:spacing w:after="200"/>
+      </w:pPr>
+      <w:r>
+        <w:rPr>
+          <w:b w:val="0"/>
+          <w:i w:val="0"/>
+        </w:rPr>
+        <w:t xml:space="preserve">Project Adviser</w:t>
+      </w:r>
+    </w:p>
+    <w:p>
+      <w:pPr>
+        <w:spacing w:after="0"/>
+      </w:pPr>
+      <w:r>
+        <w:rPr>
+          <w:b w:val="0"/>
+          <w:i w:val="0"/>
+        </w:rPr>
+        <w:t xml:space="preserve">Date Submitted: ________________________</w:t>
+      </w:r>
+    </w:p>
+    <w:p>
+      <w:r>
+        <w:br w:type="page"/>
+      </w:r>
+    </w:p>
     <w:p>
       <w:pPr>
         <w:spacing w:after="200"/>

</xml_diff>

<commit_message>
Add Review of Related Literature chapter (sources 2021-2025)
Added RRL covering usability concepts/standards (ISO 9241-11),
facial recognition and biometric attendance verification, and
usability evaluation of business/information systems, with a
synthesis identifying the gap ShelfSense addresses. All six cited
studies are dated 2023-2025 per the requested 5-year window.
Also backfilled two of the four [cite source] placeholders in the
Introduction with matching citations from this literature.

Co-Authored-By: Claude Sonnet 5 <noreply@anthropic.com>
Claude-Session: https://claude.ai/code/session_01HHgk6AxrrbQ9rP6kJ4L8ig
</commit_message>
<xml_diff>
--- a/Introduction_ShelfSense.docx
+++ b/Introduction_ShelfSense.docx
@@ -269,7 +269,7 @@
           <w:b w:val="0"/>
           <w:i w:val="0"/>
         </w:rPr>
-        <w:t>Attendance records determine payroll computation. Manual or password-only attendance recording does not confirm that the person who clocked in is the employee concerned [cite source]. Facial recognition is a biometric method that can be used to verify identity at the time of clock-in [cite source].</w:t>
+        <w:t>Attendance records determine payroll computation. Manual or password-only attendance recording does not confirm that the person who clocked in is the employee concerned (Hong &amp; Nordin, 2023). Facial recognition is a biometric method that can be used to verify identity at the time of clock-in (Valenzuela et al., 2025; Senapartha &amp; Nendya, 2024).</w:t>
       </w:r>
     </w:p>
     <w:p>
@@ -1252,6 +1252,193 @@
         <w:t>a reference for evaluating integrated retail management systems.</w:t>
       </w:r>
     </w:p>
+    <w:p>
+      <w:r>
+        <w:br w:type="page"/>
+      </w:r>
+    </w:p>
+    <w:p>
+      <w:pPr>
+        <w:spacing w:after="200"/>
+        <w:jc w:val="center"/>
+      </w:pPr>
+      <w:r>
+        <w:rPr>
+          <w:b/>
+          <w:i w:val="0"/>
+        </w:rPr>
+        <w:t>Review of Related Literature</w:t>
+      </w:r>
+    </w:p>
+    <w:p>
+      <w:pPr>
+        <w:keepNext/>
+        <w:spacing w:after="80" w:before="200"/>
+      </w:pPr>
+      <w:r>
+        <w:rPr>
+          <w:b/>
+          <w:i w:val="0"/>
+        </w:rPr>
+        <w:t>Usability Concepts and Standards</w:t>
+      </w:r>
+    </w:p>
+    <w:p>
+      <w:pPr>
+        <w:spacing w:after="120"/>
+        <w:jc w:val="both"/>
+      </w:pPr>
+      <w:r>
+        <w:rPr>
+          <w:b w:val="0"/>
+          <w:i w:val="0"/>
+        </w:rPr>
+        <w:t>Recent usability studies of Philippine and Indonesian information systems continue to apply the ISO 9241-11 framework, which separates usability into effectiveness, the accuracy and completeness with which users reach their goals; efficiency, the resources expended relative to that accuracy and completeness; and satisfaction, the user's comfort and attitude toward the system (Deluma et al., 2023; Yulizar &amp; Nabila, 2023). This study adopts the same first two components, effectiveness and efficiency, operationalized as functional correctness, task completion, and role-based access control for effectiveness, and processing time for efficiency.</w:t>
+      </w:r>
+    </w:p>
+    <w:p>
+      <w:pPr>
+        <w:spacing w:after="120"/>
+        <w:jc w:val="both"/>
+      </w:pPr>
+      <w:r>
+        <w:rPr>
+          <w:b w:val="0"/>
+          <w:i w:val="0"/>
+        </w:rPr>
+        <w:t>Deluma et al. (2023) evaluated a campus information system using performance measurement for effectiveness and efficiency and the System Usability Scale (SUS) for satisfaction, and found effectiveness and efficiency rated good at 98% and 95%, while satisfaction fell below standard at 59%. Yulizar and Nabila (2023) applied the same three-part framework to a hotel management information system and likewise found effectiveness acceptable at 83% while the SUS satisfaction score, 58.55, fell in the marginal category. Both studies show that a system can perform its functions correctly while still scoring poorly on user-reported satisfaction, which supports this study's decision to measure functional correctness, task completion, and processing time directly through reviewer evaluation of each module, rather than inferring them from a single combined satisfaction score.</w:t>
+      </w:r>
+    </w:p>
+    <w:p>
+      <w:pPr>
+        <w:keepNext/>
+        <w:spacing w:after="80" w:before="200"/>
+      </w:pPr>
+      <w:r>
+        <w:rPr>
+          <w:b/>
+          <w:i w:val="0"/>
+        </w:rPr>
+        <w:t>Facial Recognition and Biometric Attendance Verification</w:t>
+      </w:r>
+    </w:p>
+    <w:p>
+      <w:pPr>
+        <w:spacing w:after="120"/>
+        <w:jc w:val="both"/>
+      </w:pPr>
+      <w:r>
+        <w:rPr>
+          <w:b w:val="0"/>
+          <w:i w:val="0"/>
+        </w:rPr>
+        <w:t>Valenzuela et al. (2025) developed and evaluated a facial recognition-based computer laboratory attendance monitoring system using the ISO 9126 quality model. Thirty respondents, composed of students and IT professionals, rated the system across functionality, reliability, usability, efficiency, maintainability, and portability, producing a grand mean of 4.2, interpreted as Strongly Agree, though the authors also noted recognition accuracy issues under varying lighting conditions and hardware constraints.</w:t>
+      </w:r>
+    </w:p>
+    <w:p>
+      <w:pPr>
+        <w:spacing w:after="120"/>
+        <w:jc w:val="both"/>
+      </w:pPr>
+      <w:r>
+        <w:rPr>
+          <w:b w:val="0"/>
+          <w:i w:val="0"/>
+        </w:rPr>
+        <w:t>Hong and Nordin (2023) evaluated a Web-based Attendance System with Face Recognition (WAS-FR) and found that conventional, manual attendance recording is forgery-prone, imprecise, and time-consuming because it depends on the honesty of the person recording it. In their survey, 66.7% of respondents found the face-recognition system more effective and convenient than conventional attendance recording, supporting facial recognition as a verification method rather than a simple convenience feature.</w:t>
+      </w:r>
+    </w:p>
+    <w:p>
+      <w:pPr>
+        <w:spacing w:after="120"/>
+        <w:jc w:val="both"/>
+      </w:pPr>
+      <w:r>
+        <w:rPr>
+          <w:b w:val="0"/>
+          <w:i w:val="0"/>
+        </w:rPr>
+        <w:t>Senapartha and Nendya (2024) evaluated a mobile multi-factor attendance system combining face authentication, geolocation, and QR code scanning, using cognitive walkthroughs across two design iterations. Even after the recognition model was improved and the false acceptance rate was reduced, usability problems, such as ambiguous feedback and inadequate on-screen instructions, persisted and continued to cause user dissatisfaction. This finding is directly relevant to the present study: a biometric attendance feature can be technically accurate while still failing a usability or task-completion review, which is why this study evaluates ShelfSense's Face ID clock-in as a task reviewers must complete, rather than assuming it is usable because the recognition function works.</w:t>
+      </w:r>
+    </w:p>
+    <w:p>
+      <w:pPr>
+        <w:keepNext/>
+        <w:spacing w:after="80" w:before="200"/>
+      </w:pPr>
+      <w:r>
+        <w:rPr>
+          <w:b/>
+          <w:i w:val="0"/>
+        </w:rPr>
+        <w:t>Usability Evaluation of Business and Information Systems</w:t>
+      </w:r>
+    </w:p>
+    <w:p>
+      <w:pPr>
+        <w:spacing w:after="120"/>
+        <w:jc w:val="both"/>
+      </w:pPr>
+      <w:r>
+        <w:rPr>
+          <w:b w:val="0"/>
+          <w:i w:val="0"/>
+        </w:rPr>
+        <w:t>Pineda and Mercado (2025) developed a web-based employee information system for a small Philippine trucking firm to replace paper and spreadsheet-based human resource records. Ten company employees evaluated the system using the System Usability Scale, producing a mean score of 76.75, interpreted as good usability. The study is one of the few local examples that evaluates a web-based human resource system with a small panel of targeted evaluators rather than a large general user survey, which parallels the present study's use of 10 IT professor reviewers across ShelfSense's HR, finance, and POS modules.</w:t>
+      </w:r>
+    </w:p>
+    <w:p>
+      <w:pPr>
+        <w:spacing w:after="120"/>
+        <w:jc w:val="both"/>
+      </w:pPr>
+      <w:r>
+        <w:rPr>
+          <w:b w:val="0"/>
+          <w:i w:val="0"/>
+        </w:rPr>
+        <w:t>Together with Deluma et al. (2023) and Yulizar and Nabila (2023) above, these studies show that structured usability frameworks are now commonly applied with small, purposively selected panels, generally between 10 and 30 evaluators, rather than large public surveys, which supports this study's design of 10 reviewing IT professors.</w:t>
+      </w:r>
+    </w:p>
+    <w:p>
+      <w:pPr>
+        <w:keepNext/>
+        <w:spacing w:after="80" w:before="200"/>
+      </w:pPr>
+      <w:r>
+        <w:rPr>
+          <w:b/>
+          <w:i w:val="0"/>
+        </w:rPr>
+        <w:t>Synthesis</w:t>
+      </w:r>
+    </w:p>
+    <w:p>
+      <w:pPr>
+        <w:spacing w:after="120"/>
+        <w:jc w:val="both"/>
+      </w:pPr>
+      <w:r>
+        <w:rPr>
+          <w:b w:val="0"/>
+          <w:i w:val="0"/>
+        </w:rPr>
+        <w:t>The reviewed literature, all published from 2023 to 2025, shows two consistent patterns. First, studies on facial recognition and biometric attendance (Valenzuela et al., 2025; Hong &amp; Nordin, 2023; Senapartha &amp; Nendya, 2024) confirm that manual attendance is vulnerable to misrepresentation and that biometric verification is perceived as more effective, but they also show that recognition accuracy alone does not guarantee a usable feature, especially when interface feedback and instructions are weak. Second, studies that apply the ISO 9241-11 framework to campus, hospitality, and business information systems (Deluma et al., 2023; Yulizar &amp; Nabila, 2023; Pineda &amp; Mercado, 2025) consistently use small, purposively selected evaluator panels and measure effectiveness, efficiency, and satisfaction as distinct, sometimes divergent, outcomes.</w:t>
+      </w:r>
+    </w:p>
+    <w:p>
+      <w:pPr>
+        <w:spacing w:after="120"/>
+        <w:jc w:val="both"/>
+      </w:pPr>
+      <w:r>
+        <w:rPr>
+          <w:b w:val="0"/>
+          <w:i w:val="0"/>
+        </w:rPr>
+        <w:t>None of the reviewed studies, however, evaluate a single system that combines facial recognition attendance, multi-role human resource administration, supplier-linked inventory procurement, and point-of-sale transaction processing under one role-based access structure; each reviewed system addresses one function in isolation. This gap is the basis for evaluating ShelfSense as an integrated system, where effectiveness and efficiency are measured per module but role-based access control is evaluated across the system as a whole.</w:t>
+      </w:r>
+    </w:p>
     <w:sectPr>
       <w:headerReference w:type="default" r:id="rId8"/>
       <w:footerReference w:type="default" r:id="rId9"/>

</xml_diff>

<commit_message>
Add References chapter (APA, all 6 RRL/Methodology citations)
Added References with full APA entries for every source cited in the
Introduction, RRL, and Methodology. Each entry includes author(s),
year, title, venue, and a working URL/DOI where confirmed. No
page-range or DOI fields were fabricated where a source could not be
independently verified; those gaps are called out separately rather
than filled with guesses.

Co-Authored-By: Claude Sonnet 5 <noreply@anthropic.com>
Claude-Session: https://claude.ai/code/session_01HHgk6AxrrbQ9rP6kJ4L8ig
</commit_message>
<xml_diff>
--- a/Introduction_ShelfSense.docx
+++ b/Introduction_ShelfSense.docx
@@ -2499,6 +2499,121 @@
         <w:t>Task completion rate is computed per module as the number of reviewers who completed the main task without unresolved errors, divided by the total number of reviewers assigned to that module, multiplied by 100. Processing time is reported as the mean and range, in seconds or minutes, of the recorded start-to-end time per task. Likert-scale responses are tallied as frequencies and percentages per rating (5 to 1) for each statement, then converted to a mean score and interpreted using Table 3. Statement means are grouped and averaged under their criterion (Functional Correctness, Task Completion, Access Control) to produce a criterion-level mean, adjectival interpretation, and rank, in order to identify the strongest and weakest areas across modules. Results for access-control checks are reported as a simple count and percentage of modules that correctly denied out-of-role access.</w:t>
       </w:r>
     </w:p>
+    <w:p>
+      <w:r>
+        <w:br w:type="page"/>
+      </w:r>
+    </w:p>
+    <w:p>
+      <w:pPr>
+        <w:spacing w:after="200"/>
+        <w:jc w:val="center"/>
+      </w:pPr>
+      <w:r>
+        <w:rPr>
+          <w:b/>
+          <w:i w:val="0"/>
+        </w:rPr>
+        <w:t>References</w:t>
+      </w:r>
+    </w:p>
+    <w:p>
+      <w:pPr>
+        <w:spacing w:after="120"/>
+        <w:jc w:val="both"/>
+      </w:pPr>
+      <w:r>
+        <w:rPr>
+          <w:b w:val="0"/>
+          <w:i w:val="0"/>
+        </w:rPr>
+        <w:t>The following sources are cited in the Introduction, Review of Related Literature, and Methodology chapters above.</w:t>
+      </w:r>
+    </w:p>
+    <w:p>
+      <w:pPr>
+        <w:spacing w:after="160"/>
+        <w:ind w:left="720" w:hanging="720"/>
+        <w:jc w:val="both"/>
+      </w:pPr>
+      <w:r>
+        <w:rPr>
+          <w:b w:val="0"/>
+          <w:i w:val="0"/>
+        </w:rPr>
+        <w:t>Deluma, A. R., Syahrial, &amp; Maku, R. (2023). Analisis usability model ISO 9241-11 dengan pendekatan performance measurement, retrospective think aloud, dan system usability scale pada sistem informasi. Jurnal Ilmu Komputer (JUIK), 3(2). https://journal.umgo.ac.id/index.php/juik/article/view/2086</w:t>
+      </w:r>
+    </w:p>
+    <w:p>
+      <w:pPr>
+        <w:spacing w:after="160"/>
+        <w:ind w:left="720" w:hanging="720"/>
+        <w:jc w:val="both"/>
+      </w:pPr>
+      <w:r>
+        <w:rPr>
+          <w:b w:val="0"/>
+          <w:i w:val="0"/>
+        </w:rPr>
+        <w:t>Hong, Y. Z., &amp; Nordin, N. (2023). Web-based attendance system with face recognition. Multidisciplinary Applied Research and Innovation, 4(1), 35–39. https://publisher.uthm.edu.my/periodicals/index.php/mari/article/view/9900</w:t>
+      </w:r>
+    </w:p>
+    <w:p>
+      <w:pPr>
+        <w:spacing w:after="160"/>
+        <w:ind w:left="720" w:hanging="720"/>
+        <w:jc w:val="both"/>
+      </w:pPr>
+      <w:r>
+        <w:rPr>
+          <w:b w:val="0"/>
+          <w:i w:val="0"/>
+        </w:rPr>
+        <w:t>Pineda, L. A. D., &amp; Mercado, R. DC. (2025). Web-based employee information system for Hana-net Philippines Co. Inc. trucking company [Undergraduate research paper, University of the Philippines Los Baños]. UPLB Institute of Computer Science Library Repository. https://lib.ics.uplb.edu.ph/?p=3</w:t>
+      </w:r>
+    </w:p>
+    <w:p>
+      <w:pPr>
+        <w:spacing w:after="160"/>
+        <w:ind w:left="720" w:hanging="720"/>
+        <w:jc w:val="both"/>
+      </w:pPr>
+      <w:r>
+        <w:rPr>
+          <w:b w:val="0"/>
+          <w:i w:val="0"/>
+        </w:rPr>
+        <w:t>Senapartha, I. K. D., &amp; Nendya, M. B. (2024). Usability evaluation of mobile multi-factor authentication based on face authentication, geolocation and QR code. Jurnal Ilmu Pengetahuan dan Teknologi Komputer (JITK), 10(2). https://doi.org/10.33480/jitk.v10i2.5970</w:t>
+      </w:r>
+    </w:p>
+    <w:p>
+      <w:pPr>
+        <w:spacing w:after="160"/>
+        <w:ind w:left="720" w:hanging="720"/>
+        <w:jc w:val="both"/>
+      </w:pPr>
+      <w:r>
+        <w:rPr>
+          <w:b w:val="0"/>
+          <w:i w:val="0"/>
+        </w:rPr>
+        <w:t>Valenzuela, J. T., Sandigan, C. R., Villar, C. R., Litang, L. R., Obligado, J. D., Jr., &amp; Masungsong, R. A. S. (2025). Development and evaluation of a facial recognition-based computer laboratory attendance monitoring system. AEIS, 1(2). https://doi.org/10.54610/aeis.v1i2.207</w:t>
+      </w:r>
+    </w:p>
+    <w:p>
+      <w:pPr>
+        <w:spacing w:after="160"/>
+        <w:ind w:left="720" w:hanging="720"/>
+        <w:jc w:val="both"/>
+      </w:pPr>
+      <w:r>
+        <w:rPr>
+          <w:b w:val="0"/>
+          <w:i w:val="0"/>
+        </w:rPr>
+        <w:t>Yulizar, A., &amp; Nabila, R. O. (2023). Pengukuran usability sistem informasi manajemen perhotelan berdasarkan ISO 9241-11 (Studi kasus: Hotel Anugerah Palembang) [Undergraduate thesis, Universitas Sriwijaya]. UNSRI Repository. https://repository.unsri.ac.id/99313</w:t>
+      </w:r>
+    </w:p>
     <w:sectPr>
       <w:headerReference w:type="default" r:id="rId8"/>
       <w:footerReference w:type="default" r:id="rId9"/>

</xml_diff>

<commit_message>
Fill in researcher names on cover page
Submitted By now lists: Frias, Stephen; Oliquino, Tristian Gabriel;
Vale, Yexel; Rumbines, Allen.

Co-Authored-By: Claude Sonnet 5 <noreply@anthropic.com>
Claude-Session: https://claude.ai/code/session_01HHgk6AxrrbQ9rP6kJ4L8ig
</commit_message>
<xml_diff>
--- a/Introduction_ShelfSense.docx
+++ b/Introduction_ShelfSense.docx
@@ -133,14 +133,50 @@
     </w:p>
     <w:p>
       <w:pPr>
-        <w:spacing w:after="40"/>
+        <w:spacing w:after="20"/>
       </w:pPr>
       <w:r>
         <w:rPr>
           <w:b w:val="0"/>
           <w:i w:val="0"/>
         </w:rPr>
-        <w:t xml:space="preserve">______________________________</w:t>
+        <w:t xml:space="preserve">Frias, Stephen</w:t>
+      </w:r>
+    </w:p>
+    <w:p>
+      <w:pPr>
+        <w:spacing w:after="20"/>
+      </w:pPr>
+      <w:r>
+        <w:rPr>
+          <w:b w:val="0"/>
+          <w:i w:val="0"/>
+        </w:rPr>
+        <w:t xml:space="preserve">Oliquino, Tristian Gabriel</w:t>
+      </w:r>
+    </w:p>
+    <w:p>
+      <w:pPr>
+        <w:spacing w:after="20"/>
+      </w:pPr>
+      <w:r>
+        <w:rPr>
+          <w:b w:val="0"/>
+          <w:i w:val="0"/>
+        </w:rPr>
+        <w:t xml:space="preserve">Vale, Yexel</w:t>
+      </w:r>
+    </w:p>
+    <w:p>
+      <w:pPr>
+        <w:spacing w:after="40"/>
+      </w:pPr>
+      <w:r>
+        <w:rPr>
+          <w:b w:val="0"/>
+          <w:i w:val="0"/>
+        </w:rPr>
+        <w:t xml:space="preserve">Rumbines, Allen</w:t>
       </w:r>
     </w:p>
     <w:p>

</xml_diff>

<commit_message>
Complete remaining cover page fields
Program and Section: BSIT31M2
Submitted To: Mr. Manuel Salcedo (Project Adviser)
Date Submitted: October 8, 2026

Co-Authored-By: Claude Sonnet 5 <noreply@anthropic.com>
Claude-Session: https://claude.ai/code/session_01HHgk6AxrrbQ9rP6kJ4L8ig
</commit_message>
<xml_diff>
--- a/Introduction_ShelfSense.docx
+++ b/Introduction_ShelfSense.docx
@@ -200,7 +200,7 @@
           <w:b w:val="0"/>
           <w:i w:val="0"/>
         </w:rPr>
-        <w:t xml:space="preserve">Program and Section: ________________________</w:t>
+        <w:t xml:space="preserve">Program and Section: BSIT31M2</w:t>
       </w:r>
     </w:p>
     <w:p>
@@ -224,7 +224,7 @@
           <w:b w:val="0"/>
           <w:i w:val="0"/>
         </w:rPr>
-        <w:t xml:space="preserve">______________________________</w:t>
+        <w:t xml:space="preserve">Mr. Manuel Salcedo</w:t>
       </w:r>
     </w:p>
     <w:p>
@@ -248,7 +248,7 @@
           <w:b w:val="0"/>
           <w:i w:val="0"/>
         </w:rPr>
-        <w:t xml:space="preserve">Date Submitted: ________________________</w:t>
+        <w:t xml:space="preserve">Date Submitted: October 8, 2026</w:t>
       </w:r>
     </w:p>
     <w:p>

</xml_diff>